<commit_message>
Atualiza README e apresentacao para Cassio Turra (P0 do MVP)
README reflete a v9.1 (composicao ponderada, falseabilidade
quantitativa, normalizacao do N*, tabela geracional, bot de coleta de
dados) - estava descrevendo o estado da v8.0 sem nenhuma dessas
mudancas. Apresentacao ao Cassio Turra atualizada: das 3 lacunas
apresentadas antes, 2 foram fechadas (normalizacao e falseabilidade,
agora em "o que esta implementado"); resta so o Fator_Alocativo/NTA
como lacuna central e gancho do convite.
</commit_message>
<xml_diff>
--- a/docs/apresentacao_cassio_turra.docx
+++ b/docs/apresentacao_cassio_turra.docx
@@ -37,7 +37,7 @@
           <w:sz w:val="22"/>
           <w:szCs w:val="22"/>
         </w:rPr>
-        <w:t xml:space="preserve">Itiberê L. G. C. Muarrek — Doutorado em Economia Política. Documento preparado em 2026-07-03 para apresentação ao Prof. Cássio M. Turra (Cedeplar/UFMG).</w:t>
+        <w:t xml:space="preserve">Itiberê L. G. C. Muarrek — Doutorado em Economia Política. Documento revisado em 2026-07-13 para apresentação ao Prof. Cássio M. Turra (Cedeplar/UFMG).</w:t>
       </w:r>
     </w:p>
     <w:p>
@@ -61,7 +61,7 @@
           <w:sz w:val="22"/>
           <w:szCs w:val="22"/>
         </w:rPr>
-        <w:t xml:space="preserve">O AINU-Narayama é o instrumento computacional de uma tese de doutorado em Economia Política intitulada "Do Dilema de Narayama ao Oicoceno Civilizacional", que propõe o Índice de Narayama Sistêmico (N*) como termômetro da sustentabilidade intergeracional de uma sociedade. O índice combina a potência demográfica presente de um país (NGII_puro — razão entre a coorte formadora e a coorte legatária, ponderada pelo saldo vegetativo) com a trajetória de fecundidade entre gerações (Fator_Geracional — razão entre a TFR atual e a TFR de 25 anos atrás).</w:t>
+        <w:t xml:space="preserve">O AINU-Narayama é o instrumento computacional de uma tese de doutorado em Economia Política intitulada "Do Dilema de Narayama ao Oicoceno Civilizacional", que propõe o Índice de Narayama Sistêmico (N*) como termômetro da sustentabilidade intergeracional de uma sociedade. O índice combina a potência demográfica presente de um país (NGII — razão entre a coorte formadora e a coorte legatária, ponderada pelo saldo vegetativo, depurada por um protocolo de falseabilidade quantitativo) com a trajetória de fecundidade entre gerações (Fator_Geracional).</w:t>
       </w:r>
     </w:p>
     <w:p>
@@ -93,7 +93,7 @@
           <w:sz w:val="22"/>
           <w:szCs w:val="22"/>
         </w:rPr>
-        <w:t xml:space="preserve">O projeto está em fase inicial de implementação computacional. O objetivo deste documento é situar com precisão onde a implementação já é sólida e reprodutível, e onde a colaboração de um pesquisador com a experiência do Prof. Turra em Contas de Transferências Nacionais (NTA) seria decisiva para o avanço da tese.</w:t>
+        <w:t xml:space="preserve">Nas últimas semanas, três correções metodológicas importantes foram implementadas, testadas e incorporadas de volta na própria tese (revisão v9.1): a composição ponderada de perfis estruturais dos 28 países, o Protocolo de Falseabilidade quantitativo, e a normalização do N*. O objetivo deste documento é situar com precisão onde a implementação já é sólida e reprodutível, e onde a colaboração de um pesquisador com a experiência do Prof. Turra em Contas de Transferências Nacionais (NTA) seria decisiva para o avanço da tese.</w:t>
       </w:r>
     </w:p>
     <w:p>
@@ -185,7 +185,7 @@
                 <w:sz w:val="20"/>
                 <w:szCs w:val="20"/>
               </w:rPr>
-              <w:t xml:space="preserve">Implementada conforme Anexo 1 da tese (formalização matemática): NGII_puro = (Pop_Base/Pop_Topo) × (Nascimentos/Mortes); N* = NGII_puro × Fator_Geracional.</w:t>
+              <w:t xml:space="preserve">N* = raiz quadrada do N_Base (= NGII_Puro × Fator_Geracional), normalização incorporada na tese v9.1 (12/07/2026) após comparação de 3 métodos com dados reais dos 28 países.</w:t>
             </w:r>
           </w:p>
         </w:tc>
@@ -203,7 +203,7 @@
                 <w:sz w:val="20"/>
                 <w:szCs w:val="20"/>
               </w:rPr>
-              <w:t xml:space="preserve">Dados demográficos</w:t>
+              <w:t xml:space="preserve">Composição de perfis</w:t>
             </w:r>
           </w:p>
         </w:tc>
@@ -219,7 +219,7 @@
                 <w:sz w:val="20"/>
                 <w:szCs w:val="20"/>
               </w:rPr>
-              <w:t xml:space="preserve">UN World Population Prospects 2024 Revision (variante Medium, dados de idade simples), obtidos diretamente da fonte oficial para os 28 países da amostra (Anexo 5 da tese).</w:t>
+              <w:t xml:space="preserve">Cada um dos 28 países é uma composição ponderada de 2-3 perfis estruturais adjacentes (Seção 5.2), não um perfil único — corrige uma simplificação anterior da implementação.</w:t>
             </w:r>
           </w:p>
         </w:tc>
@@ -237,7 +237,7 @@
                 <w:sz w:val="20"/>
                 <w:szCs w:val="20"/>
               </w:rPr>
-              <w:t xml:space="preserve">Cortes etários</w:t>
+              <w:t xml:space="preserve">Protocolo de Falseabilidade</w:t>
             </w:r>
           </w:p>
         </w:tc>
@@ -253,7 +253,7 @@
                 <w:sz w:val="20"/>
                 <w:szCs w:val="20"/>
               </w:rPr>
-              <w:t xml:space="preserve">Por Perfil Estrutural (A a E), conforme Tabela 14 da tese.</w:t>
+              <w:t xml:space="preserve">Versão quantitativa (Anexo 9, v9.1): 4 ajustes multiplicativos (migração, inércia demográfica, políticas natalistas temporárias, sub-registro), calibrados para os 28 países dentro do critério de aceitação (redução total 25%-45%).</w:t>
             </w:r>
           </w:p>
         </w:tc>
@@ -271,7 +271,7 @@
                 <w:sz w:val="20"/>
                 <w:szCs w:val="20"/>
               </w:rPr>
-              <w:t xml:space="preserve">Reprodutibilidade</w:t>
+              <w:t xml:space="preserve">Classificação de zonas</w:t>
             </w:r>
           </w:p>
         </w:tc>
@@ -287,7 +287,7 @@
                 <w:sz w:val="20"/>
                 <w:szCs w:val="20"/>
               </w:rPr>
-              <w:t xml:space="preserve">Código aberto e versionado; pipeline executável (src/data_pipeline.py); dados brutos e resultados commitados no repositório.</w:t>
+              <w:t xml:space="preserve">5 zonas (PEC, Tensão Acelerada, PEA, Tensão Populacional, PEEC), com PEEC agora também diagnosticado por N* — visualizado na "Tabela Geracional", grade comparativa dos 28 países em formato inspirado na tabela periódica dos elementos.</w:t>
             </w:r>
           </w:p>
         </w:tc>
@@ -305,6 +305,74 @@
                 <w:sz w:val="20"/>
                 <w:szCs w:val="20"/>
               </w:rPr>
+              <w:t xml:space="preserve">Dados demográficos</w:t>
+            </w:r>
+          </w:p>
+        </w:tc>
+        <w:tc>
+          <w:tcPr>
+            <w:tcW w:type="dxa" w:w="6200"/>
+          </w:tcPr>
+          <w:p>
+            <w:r>
+              <w:rPr>
+                <w:b w:val="false"/>
+                <w:bCs w:val="false"/>
+                <w:sz w:val="20"/>
+                <w:szCs w:val="20"/>
+              </w:rPr>
+              <w:t xml:space="preserve">UN World Population Prospects 2024 Revision e UN International Migrant Stock 2024, obtidos diretamente das fontes oficiais. Um workflow agendado (mensal) coleta atualizações automaticamente e abre revisão via Pull Request.</w:t>
+            </w:r>
+          </w:p>
+        </w:tc>
+      </w:tr>
+      <w:tr>
+        <w:tc>
+          <w:tcPr>
+            <w:tcW w:type="dxa" w:w="3200"/>
+          </w:tcPr>
+          <w:p>
+            <w:r>
+              <w:rPr>
+                <w:b w:val="false"/>
+                <w:bCs w:val="false"/>
+                <w:sz w:val="20"/>
+                <w:szCs w:val="20"/>
+              </w:rPr>
+              <w:t xml:space="preserve">Reprodutibilidade</w:t>
+            </w:r>
+          </w:p>
+        </w:tc>
+        <w:tc>
+          <w:tcPr>
+            <w:tcW w:type="dxa" w:w="6200"/>
+          </w:tcPr>
+          <w:p>
+            <w:r>
+              <w:rPr>
+                <w:b w:val="false"/>
+                <w:bCs w:val="false"/>
+                <w:sz w:val="20"/>
+                <w:szCs w:val="20"/>
+              </w:rPr>
+              <w:t xml:space="preserve">Código aberto e versionado; pipeline executável (src/data_pipeline.py); dados brutos e resultados commitados no repositório; CI valida a consistência a cada mudança.</w:t>
+            </w:r>
+          </w:p>
+        </w:tc>
+      </w:tr>
+      <w:tr>
+        <w:tc>
+          <w:tcPr>
+            <w:tcW w:type="dxa" w:w="3200"/>
+          </w:tcPr>
+          <w:p>
+            <w:r>
+              <w:rPr>
+                <w:b w:val="false"/>
+                <w:bCs w:val="false"/>
+                <w:sz w:val="20"/>
+                <w:szCs w:val="20"/>
+              </w:rPr>
               <w:t xml:space="preserve">Publicação</w:t>
             </w:r>
           </w:p>
@@ -343,7 +411,7 @@
         </w:rPr>
         <w:t xml:space="preserve">Plataforma de pesquisa: </w:t>
       </w:r>
-      <w:hyperlink w:history="1" r:id="rIdqqhkpynaass9ofkfussxy">
+      <w:hyperlink w:history="1" r:id="rId_trfpb-ilbr1f41jwj7do">
         <w:r>
           <w:rPr>
             <w:rStyle w:val="Hyperlink"/>
@@ -365,7 +433,7 @@
         </w:rPr>
         <w:t xml:space="preserve">Plataforma pública: </w:t>
       </w:r>
-      <w:hyperlink w:history="1" r:id="rIdkmj1phgrvir1y3mscvkeb">
+      <w:hyperlink w:history="1" r:id="rIdqyr7g06jcnfxay4hwuyi8">
         <w:r>
           <w:rPr>
             <w:rStyle w:val="Hyperlink"/>
@@ -387,7 +455,7 @@
         </w:rPr>
         <w:t xml:space="preserve">Repositório (código e documentação técnica completa): </w:t>
       </w:r>
-      <w:hyperlink w:history="1" r:id="rIdcf4zpeiklizv5crgb7gue">
+      <w:hyperlink w:history="1" r:id="rIdtddvuy2dpt2o-xp5fuyii">
         <w:r>
           <w:rPr>
             <w:rStyle w:val="Hyperlink"/>
@@ -403,7 +471,7 @@
         <w:pStyle w:val="Heading1"/>
       </w:pPr>
       <w:r>
-        <w:t xml:space="preserve">3. Lacunas identificadas</w:t>
+        <w:t xml:space="preserve">3. Lacuna identificada</w:t>
       </w:r>
     </w:p>
     <w:p>
@@ -419,7 +487,7 @@
           <w:sz w:val="22"/>
           <w:szCs w:val="22"/>
         </w:rPr>
-        <w:t xml:space="preserve">Três lacunas metodológicas foram identificadas e documentadas com precisão técnica (docs/definitions.md, seções 8 e 9 do repositório). Apresentamos as três, mas destacamos que a segunda é diretamente a área de pesquisa do Prof. Turra.</w:t>
+        <w:t xml:space="preserve">Das três lacunas apresentadas em versões anteriores deste documento, duas foram fechadas nas últimas semanas (normalização do N* e Protocolo de Falseabilidade, ambas descritas na seção 2 acima, documentadas em detalhe em docs/registro_mudancas_metodologicas_2026-07.docx no repositório). Resta uma lacuna central, que é diretamente a área de pesquisa do Prof. Turra.</w:t>
       </w:r>
     </w:p>
     <w:p>
@@ -427,7 +495,7 @@
         <w:pStyle w:val="Heading2"/>
       </w:pPr>
       <w:r>
-        <w:t xml:space="preserve">3.1 Ausência de normalização do N_Base</w:t>
+        <w:t xml:space="preserve">3.1 Fator_Alocativo sem base de dados de NTA integrada</w:t>
       </w:r>
     </w:p>
     <w:p>
@@ -443,46 +511,6 @@
           <w:sz w:val="22"/>
           <w:szCs w:val="22"/>
         </w:rPr>
-        <w:t xml:space="preserve">A tese, mesmo em sua formalização matemática mais rigorosa (Anexo 1), não define nenhum procedimento de normalização, truncamento ou escala para o N_Base. Isso produz valores muito elevados (N* &gt; 10) em países de alta fecundidade e estrutura etária jovem — por exemplo, com dados reais da UN WPP 2024, Nigéria, Etiópia, Egito e República Democrática do Congo apresentam N* entre 6 e 16 — dificultando a leitura comparativa entre países de perfis demográficos muito distintos.</w:t>
-      </w:r>
-    </w:p>
-    <w:p>
-      <w:pPr>
-        <w:spacing w:after="180"/>
-      </w:pPr>
-      <w:r>
-        <w:rPr>
-          <w:b w:val="false"/>
-          <w:bCs w:val="false"/>
-          <w:i/>
-          <w:iCs/>
-          <w:sz w:val="22"/>
-          <w:szCs w:val="22"/>
-        </w:rPr>
-        <w:t xml:space="preserve">Questão em aberto: que procedimento de padronização (transformação logarítmica, padronização pelo desvio-padrão da amostra, ancoragem teórica em um valor de referência, ou outro) preservaria a interpretação substantiva do índice sem distorcer a ordenação entre países?</w:t>
-      </w:r>
-    </w:p>
-    <w:p>
-      <w:pPr>
-        <w:pStyle w:val="Heading2"/>
-      </w:pPr>
-      <w:r>
-        <w:t xml:space="preserve">3.2 Fator_Alocativo sem base de dados de NTA integrada</w:t>
-      </w:r>
-    </w:p>
-    <w:p>
-      <w:pPr>
-        <w:spacing w:after="180"/>
-      </w:pPr>
-      <w:r>
-        <w:rPr>
-          <w:b w:val="false"/>
-          <w:bCs w:val="false"/>
-          <w:i w:val="false"/>
-          <w:iCs w:val="false"/>
-          <w:sz w:val="22"/>
-          <w:szCs w:val="22"/>
-        </w:rPr>
         <w:t xml:space="preserve">A fórmula do Fator_Alocativo (NTA(0-25)/NTA(65+)) e sua classificação em farol institucional (+/n/-) já estão implementadas e testadas no código do projeto. O que falta é a fonte de dados: diferentemente da UN World Population Prospects, os dados de Contas de Transferências Nacionais não estão disponíveis em formato tabular público e uniforme para os 28 países da amostra — estão dispersos em publicações acadêmicas e relatórios de projeto, país a país.</w:t>
       </w:r>
     </w:p>
@@ -497,7 +525,7 @@
         </w:rPr>
         <w:t xml:space="preserve">Esta é precisamente a área de pesquisa do Prof. Turra, como Representante Regional das Américas do </w:t>
       </w:r>
-      <w:hyperlink w:history="1" r:id="rIdeqj3hqb1h71wkbg3khvoz">
+      <w:hyperlink w:history="1" r:id="rId29quqwsajqzq1h7431hnb">
         <w:r>
           <w:rPr>
             <w:rStyle w:val="Hyperlink"/>
@@ -520,7 +548,7 @@
         <w:pStyle w:val="Heading2"/>
       </w:pPr>
       <w:r>
-        <w:t xml:space="preserve">3.3 Protocolo de Falseabilidade sem dados históricos suficientes</w:t>
+        <w:t xml:space="preserve">3.2 Falseabilidade — parcialmente automatizada</w:t>
       </w:r>
     </w:p>
     <w:p>
@@ -536,7 +564,7 @@
           <w:sz w:val="22"/>
           <w:szCs w:val="22"/>
         </w:rPr>
-        <w:t xml:space="preserve">Os 7 testes descritos no Anexo 9 da tese (falseabilidade migratória, assistencial, conjuntural, natalista, etária, de substituição civilizacional e de resistência a choques) estão implementados qualitativamente no código (src/falseability.py), mas exigem séries históricas longas (15 anos ou mais), decomposição de fluxos migratórios e comparação entre TFR oficial e TFR nativa estimada — dados que a fase atual do pipeline (baseada exclusivamente na UN WPP corrente) ainda não cobre.</w:t>
+        <w:t xml:space="preserve">A fórmula quantitativa do Protocolo de Falseabilidade está fechada e calibrada, mas 2 dos seus 4 ajustes ainda não têm coleta automatizada de dados: sub-registro/mortalidade infantil (a fonte pública, IHME Global Burden of Disease, exige criação de conta) e políticas natalistas temporárias (não é um dado estruturado — exige pesquisa qualitativa país a país). O ajuste migratório já tem coleta automatizada (UN International Migrant Stock), com a ressalva de ser um proxy do estoque de imigrantes, não da métrica exata definida no protocolo.</w:t>
       </w:r>
     </w:p>
     <w:p>
@@ -560,7 +588,7 @@
           <w:sz w:val="22"/>
           <w:szCs w:val="22"/>
         </w:rPr>
-        <w:t xml:space="preserve">Diante do exposto, gostaríamos de convidar formalmente o Prof. Cássio M. Turra para orientar o desenvolvimento desta tese, com ênfase particular na integração de dados reais de Contas de Transferências Nacionais ao Fator_Alocativo (seção 3.2) — mas também nas demais questões metodológicas em aberto, dado seu conhecimento amplo em demografia econômica e envelhecimento populacional.</w:t>
+        <w:t xml:space="preserve">Diante do exposto, gostaríamos de convidar formalmente o Prof. Cássio M. Turra para orientar o desenvolvimento desta tese, com ênfase particular na integração de dados reais de Contas de Transferências Nacionais ao Fator_Alocativo (seção 3.1) — a única lacuna estrutural que resta no modelo, dado seu conhecimento direto e aplicado nessa área específica.</w:t>
       </w:r>
     </w:p>
     <w:p>
@@ -576,7 +604,7 @@
           <w:sz w:val="22"/>
           <w:szCs w:val="22"/>
         </w:rPr>
-        <w:t xml:space="preserve">Toda a base de código, dados e documentação técnica está disponível publicamente para revisão prévia, e o autor está à disposição para apresentar o projeto com mais detalhe, discutir a metodologia da tese v8.0 na íntegra, ou ajustar o escopo da colaboração conforme a disponibilidade e o interesse do professor.</w:t>
+        <w:t xml:space="preserve">Toda a base de código, dados e documentação técnica está disponível publicamente para revisão prévia, e o autor está à disposição para apresentar o projeto com mais detalhe, discutir a metodologia da tese v9.1 na íntegra, ou ajustar o escopo da colaboração conforme a disponibilidade e o interesse do professor.</w:t>
       </w:r>
     </w:p>
     <w:p>
@@ -590,7 +618,7 @@
           <w:sz w:val="18"/>
           <w:szCs w:val="18"/>
         </w:rPr>
-        <w:t xml:space="preserve">Fontes: V1_EcoPol_062426_v8.0.docx (tese, Anexo 1, Anexo 5, Anexo 9, Tabela 14); docs/definitions.md do repositório AINU-Narayama; UN World Population Prospects 2024 Revision; National Transfer Accounts Project.</w:t>
+        <w:t xml:space="preserve">Fontes: V1_EcoPol_062426_v8.0.docx e V1_EcoPol_070726_v9_1.docx (tese, Anexo 1, Anexo 5, Anexo 9, Seção 9-A); docs/definitions.md e docs/registro_mudancas_metodologicas_2026-07.docx do repositório AINU-Narayama; UN World Population Prospects 2024 Revision; UN International Migrant Stock 2024; National Transfer Accounts Project.</w:t>
       </w:r>
     </w:p>
     <w:sectPr>

</xml_diff>